<commit_message>
docs: actualisation du modele economique v2.0 selon directives DG (0% prelevement B2B, frais fixes 600F et 150F, livraison kilometrique 500F 2km + 150F/km)
</commit_message>
<xml_diff>
--- a/docs/01_DOCUMENT_METIER_ET_REGLES_DE_GESTION.docx
+++ b/docs/01_DOCUMENT_METIER_ET_REGLES_DE_GESTION.docx
@@ -2608,7 +2608,286 @@
           <w:color w:val="132A45"/>
           <w:sz w:val="28"/>
         </w:rPr>
-        <w:t>5. Règles Financières &amp; Tarification (Zone FCFA)</w:t>
+        <w:t>5. Règles Financières &amp; Tarification Officielle (Directives DG Octobre 2026)</w:t>
+      </w:r>
+    </w:p>
+    <w:p>
+      <w:pPr>
+        <w:keepNext/>
+        <w:spacing w:before="200" w:after="80"/>
+      </w:pPr>
+      <w:r>
+        <w:rPr>
+          <w:rFonts w:ascii="Arial" w:hAnsi="Arial"/>
+          <w:b/>
+          <w:color w:val="529927"/>
+          <w:sz w:val="24"/>
+        </w:rPr>
+        <w:t>5.1. Politique Tripartite : Zéro Prélèvement Partenaires &amp; Frais de Service Fixes</w:t>
+      </w:r>
+    </w:p>
+    <w:p>
+      <w:pPr>
+        <w:pStyle w:val="ListBullet"/>
+        <w:spacing w:before="20" w:after="40" w:line="276" w:lineRule="auto"/>
+      </w:pPr>
+      <w:r>
+        <w:rPr>
+          <w:b/>
+          <w:color w:val="1E293B"/>
+        </w:rPr>
+        <w:t>Pour les Hôpitaux &amp; Cliniques :</w:t>
+      </w:r>
+    </w:p>
+    <w:p>
+      <w:pPr>
+        <w:pStyle w:val="ListBullet"/>
+        <w:spacing w:before="20" w:after="40" w:line="276" w:lineRule="auto"/>
+      </w:pPr>
+      <w:r>
+        <w:rPr>
+          <w:b/>
+          <w:color w:val="1E293B"/>
+        </w:rPr>
+        <w:t>Liberté tarifaire totale :</w:t>
+      </w:r>
+      <w:r>
+        <w:rPr>
+          <w:color w:val="1E293B"/>
+        </w:rPr>
+        <w:t xml:space="preserve"> Chaque établissement fixe librement son tarif de téléconsultation (ex: 2 500 FCFA, 5 000 FCFA, etc.).</w:t>
+      </w:r>
+    </w:p>
+    <w:p>
+      <w:pPr>
+        <w:pStyle w:val="ListBullet"/>
+        <w:spacing w:before="20" w:after="40" w:line="276" w:lineRule="auto"/>
+      </w:pPr>
+      <w:r>
+        <w:rPr>
+          <w:b/>
+          <w:color w:val="1E293B"/>
+        </w:rPr>
+        <w:t>0% de prélèvement :</w:t>
+      </w:r>
+      <w:r>
+        <w:rPr>
+          <w:color w:val="1E293B"/>
+        </w:rPr>
+        <w:t xml:space="preserve"> L'hôpital perçoit </w:t>
+      </w:r>
+      <w:r>
+        <w:rPr>
+          <w:b/>
+          <w:color w:val="1E293B"/>
+        </w:rPr>
+        <w:t>100% de son tarif</w:t>
+      </w:r>
+      <w:r>
+        <w:rPr>
+          <w:color w:val="1E293B"/>
+        </w:rPr>
+        <w:t xml:space="preserve"> de consultation sans aucune retenue.</w:t>
+      </w:r>
+    </w:p>
+    <w:p>
+      <w:pPr>
+        <w:pStyle w:val="ListBullet"/>
+        <w:spacing w:before="20" w:after="40" w:line="276" w:lineRule="auto"/>
+      </w:pPr>
+      <w:r>
+        <w:rPr>
+          <w:b/>
+          <w:color w:val="1E293B"/>
+        </w:rPr>
+        <w:t>Frais de service eDoctor (600 FCFA) :</w:t>
+      </w:r>
+      <w:r>
+        <w:rPr>
+          <w:color w:val="1E293B"/>
+        </w:rPr>
+        <w:t xml:space="preserve"> Facturés en sus au patient pour la plateforme, la visio chiffrée, le dossier médical et l'absorption intégrale des frais de transaction Mobile Money (T-Money, Flooz).</w:t>
+      </w:r>
+    </w:p>
+    <w:p>
+      <w:pPr>
+        <w:pStyle w:val="ListBullet"/>
+        <w:spacing w:before="20" w:after="40" w:line="276" w:lineRule="auto"/>
+      </w:pPr>
+      <w:r>
+        <w:rPr>
+          <w:b/>
+          <w:color w:val="1E293B"/>
+        </w:rPr>
+        <w:t>Pour les Pharmacies d'Officine :</w:t>
+      </w:r>
+    </w:p>
+    <w:p>
+      <w:pPr>
+        <w:pStyle w:val="ListBullet"/>
+        <w:spacing w:before="20" w:after="40" w:line="276" w:lineRule="auto"/>
+      </w:pPr>
+      <w:r>
+        <w:rPr>
+          <w:b/>
+          <w:color w:val="1E293B"/>
+        </w:rPr>
+        <w:t>0% de prélèvement sur les médicaments :</w:t>
+      </w:r>
+      <w:r>
+        <w:rPr>
+          <w:color w:val="1E293B"/>
+        </w:rPr>
+        <w:t xml:space="preserve"> L'officine perçoit </w:t>
+      </w:r>
+      <w:r>
+        <w:rPr>
+          <w:b/>
+          <w:color w:val="1E293B"/>
+        </w:rPr>
+        <w:t>100% du prix officiel</w:t>
+      </w:r>
+      <w:r>
+        <w:rPr>
+          <w:color w:val="1E293B"/>
+        </w:rPr>
+        <w:t xml:space="preserve"> des médicaments vendus.</w:t>
+      </w:r>
+    </w:p>
+    <w:p>
+      <w:pPr>
+        <w:pStyle w:val="ListBullet"/>
+        <w:spacing w:before="20" w:after="40" w:line="276" w:lineRule="auto"/>
+      </w:pPr>
+      <w:r>
+        <w:rPr>
+          <w:b/>
+          <w:color w:val="1E293B"/>
+        </w:rPr>
+        <w:t>Frais de mise en relation de stock (150 FCFA) :</w:t>
+      </w:r>
+      <w:r>
+        <w:rPr>
+          <w:color w:val="1E293B"/>
+        </w:rPr>
+        <w:t xml:space="preserve"> Facturés au patient lors de la commande pour la géolocalisation de l'officine de garde et la garantie de stock en direct.</w:t>
+      </w:r>
+    </w:p>
+    <w:p>
+      <w:pPr>
+        <w:pStyle w:val="ListBullet"/>
+        <w:spacing w:before="20" w:after="40" w:line="276" w:lineRule="auto"/>
+      </w:pPr>
+      <w:r>
+        <w:rPr>
+          <w:b/>
+          <w:color w:val="1E293B"/>
+        </w:rPr>
+        <w:t>Pour la Livraison à Domicile par Coursier :</w:t>
+      </w:r>
+    </w:p>
+    <w:p>
+      <w:pPr>
+        <w:pStyle w:val="ListBullet"/>
+        <w:spacing w:before="20" w:after="40" w:line="276" w:lineRule="auto"/>
+      </w:pPr>
+      <w:r>
+        <w:rPr>
+          <w:b/>
+          <w:color w:val="1E293B"/>
+        </w:rPr>
+        <w:t>Forfait de base : 500 FCFA</w:t>
+      </w:r>
+      <w:r>
+        <w:rPr>
+          <w:color w:val="1E293B"/>
+        </w:rPr>
+        <w:t xml:space="preserve"> incluant les </w:t>
+      </w:r>
+      <w:r>
+        <w:rPr>
+          <w:b/>
+          <w:color w:val="1E293B"/>
+        </w:rPr>
+        <w:t>2 premiers kilomètres</w:t>
+      </w:r>
+      <w:r>
+        <w:rPr>
+          <w:color w:val="1E293B"/>
+        </w:rPr>
+        <w:t>.</w:t>
+      </w:r>
+    </w:p>
+    <w:p>
+      <w:pPr>
+        <w:pStyle w:val="ListBullet"/>
+        <w:spacing w:before="20" w:after="40" w:line="276" w:lineRule="auto"/>
+      </w:pPr>
+      <w:r>
+        <w:rPr>
+          <w:b/>
+          <w:color w:val="1E293B"/>
+        </w:rPr>
+        <w:t>150 FCFA par kilomètre supplémentaire</w:t>
+      </w:r>
+      <w:r>
+        <w:rPr>
+          <w:color w:val="1E293B"/>
+        </w:rPr>
+        <w:t xml:space="preserve"> au-delà des 2 premiers km.</w:t>
+      </w:r>
+    </w:p>
+    <w:p>
+      <w:pPr>
+        <w:pStyle w:val="ListBullet"/>
+        <w:spacing w:before="20" w:after="40" w:line="276" w:lineRule="auto"/>
+      </w:pPr>
+      <w:r>
+        <w:rPr>
+          <w:color w:val="1E293B"/>
+        </w:rPr>
+        <w:t xml:space="preserve">Formule : </w:t>
+      </w:r>
+      <w:r>
+        <w:rPr>
+          <w:rFonts w:ascii="Consolas" w:hAnsi="Consolas"/>
+          <w:color w:val="132A45"/>
+          <w:sz w:val="19"/>
+        </w:rPr>
+        <w:t>Frais de livraison = 500 FCFA + [max(0, Distance_km - 2) × 150 FCFA]</w:t>
+      </w:r>
+      <w:r>
+        <w:rPr>
+          <w:color w:val="1E293B"/>
+        </w:rPr>
+        <w:t>.</w:t>
+      </w:r>
+    </w:p>
+    <w:p>
+      <w:pPr>
+        <w:pStyle w:val="ListBullet"/>
+        <w:spacing w:before="20" w:after="40" w:line="276" w:lineRule="auto"/>
+      </w:pPr>
+      <w:r>
+        <w:rPr>
+          <w:color w:val="1E293B"/>
+        </w:rPr>
+        <w:t>Répartition : ~75% reversés au coursier partenaire et ~25% conservés par eDoctor (coordination logistique).</w:t>
+      </w:r>
+    </w:p>
+    <w:p>
+      <w:pPr>
+        <w:keepNext/>
+        <w:spacing w:before="200" w:after="80"/>
+      </w:pPr>
+      <w:r>
+        <w:rPr>
+          <w:rFonts w:ascii="Arial" w:hAnsi="Arial"/>
+          <w:b/>
+          <w:color w:val="529927"/>
+          <w:sz w:val="24"/>
+        </w:rPr>
+        <w:t>5.2. Tableau de Synthèse des Flux par Transaction</w:t>
       </w:r>
     </w:p>
     <w:tbl>
@@ -2619,14 +2898,16 @@
         <w:tblLook w:firstColumn="1" w:firstRow="1" w:lastColumn="0" w:lastRow="0" w:noHBand="0" w:noVBand="1" w:val="04A0"/>
       </w:tblPr>
       <w:tblGrid>
-        <w:gridCol w:w="3120"/>
-        <w:gridCol w:w="3120"/>
-        <w:gridCol w:w="3120"/>
+        <w:gridCol w:w="1872"/>
+        <w:gridCol w:w="1872"/>
+        <w:gridCol w:w="1872"/>
+        <w:gridCol w:w="1872"/>
+        <w:gridCol w:w="1872"/>
       </w:tblGrid>
       <w:tr>
         <w:tc>
           <w:tcPr>
-            <w:tcW w:type="dxa" w:w="3120"/>
+            <w:tcW w:type="dxa" w:w="1872"/>
             <w:shd w:fill="132A45"/>
             <w:tcMar>
               <w:top w:w="120" w:type="dxa"/>
@@ -2656,7 +2937,7 @@
         </w:tc>
         <w:tc>
           <w:tcPr>
-            <w:tcW w:type="dxa" w:w="3120"/>
+            <w:tcW w:type="dxa" w:w="1872"/>
             <w:shd w:fill="132A45"/>
             <w:tcMar>
               <w:top w:w="120" w:type="dxa"/>
@@ -2680,13 +2961,13 @@
                 <w:b/>
                 <w:color w:val="FFFFFF"/>
               </w:rPr>
-              <w:t>Modalité de Paiement</w:t>
+              <w:t>Montant Réglé par le Patient</w:t>
             </w:r>
           </w:p>
         </w:tc>
         <w:tc>
           <w:tcPr>
-            <w:tcW w:type="dxa" w:w="3120"/>
+            <w:tcW w:type="dxa" w:w="1872"/>
             <w:shd w:fill="132A45"/>
             <w:tcMar>
               <w:top w:w="120" w:type="dxa"/>
@@ -2710,7 +2991,67 @@
                 <w:b/>
                 <w:color w:val="FFFFFF"/>
               </w:rPr>
-              <w:t>Flux Financier</w:t>
+              <w:t>Part Reversée Hôpital</w:t>
+            </w:r>
+          </w:p>
+        </w:tc>
+        <w:tc>
+          <w:tcPr>
+            <w:tcW w:type="dxa" w:w="1872"/>
+            <w:shd w:fill="132A45"/>
+            <w:tcMar>
+              <w:top w:w="120" w:type="dxa"/>
+              <w:bottom w:w="120" w:type="dxa"/>
+              <w:left w:w="150" w:type="dxa"/>
+              <w:right w:w="150" w:type="dxa"/>
+            </w:tcMar>
+          </w:tcPr>
+          <w:p>
+            <w:pPr>
+              <w:spacing w:before="80" w:after="80" w:line="276" w:lineRule="auto"/>
+            </w:pPr>
+            <w:r>
+              <w:rPr>
+                <w:b/>
+                <w:color w:val="FFFFFF"/>
+              </w:rPr>
+            </w:r>
+            <w:r>
+              <w:rPr>
+                <w:b/>
+                <w:color w:val="FFFFFF"/>
+              </w:rPr>
+              <w:t>Part Pharmacie / Coursier</w:t>
+            </w:r>
+          </w:p>
+        </w:tc>
+        <w:tc>
+          <w:tcPr>
+            <w:tcW w:type="dxa" w:w="1872"/>
+            <w:shd w:fill="132A45"/>
+            <w:tcMar>
+              <w:top w:w="120" w:type="dxa"/>
+              <w:bottom w:w="120" w:type="dxa"/>
+              <w:left w:w="150" w:type="dxa"/>
+              <w:right w:w="150" w:type="dxa"/>
+            </w:tcMar>
+          </w:tcPr>
+          <w:p>
+            <w:pPr>
+              <w:spacing w:before="80" w:after="80" w:line="276" w:lineRule="auto"/>
+            </w:pPr>
+            <w:r>
+              <w:rPr>
+                <w:b/>
+                <w:color w:val="FFFFFF"/>
+              </w:rPr>
+            </w:r>
+            <w:r>
+              <w:rPr>
+                <w:b/>
+                <w:color w:val="FFFFFF"/>
+              </w:rPr>
+              <w:t>Revenu Net eDoctor</w:t>
             </w:r>
           </w:p>
         </w:tc>
@@ -2718,7 +3059,7 @@
       <w:tr>
         <w:tc>
           <w:tcPr>
-            <w:tcW w:type="dxa" w:w="3120"/>
+            <w:tcW w:type="dxa" w:w="1872"/>
             <w:shd w:fill="F8FAFC"/>
             <w:tcMar>
               <w:top w:w="120" w:type="dxa"/>
@@ -2737,13 +3078,13 @@
                 <w:b/>
                 <w:color w:val="1E293B"/>
               </w:rPr>
-              <w:t>Téléconsultation médicale</w:t>
+              <w:t>Téléconsultation (Ex: 3 000 F)</w:t>
             </w:r>
           </w:p>
         </w:tc>
         <w:tc>
           <w:tcPr>
-            <w:tcW w:type="dxa" w:w="3120"/>
+            <w:tcW w:type="dxa" w:w="1872"/>
             <w:shd w:fill="F8FAFC"/>
             <w:tcMar>
               <w:top w:w="120" w:type="dxa"/>
@@ -2761,13 +3102,45 @@
               <w:rPr>
                 <w:color w:val="1E293B"/>
               </w:rPr>
-              <w:t>Paiement préalable à l'acte ou à la clôture (Mobile Money : T-Money, Flooz).</w:t>
+              <w:t xml:space="preserve">3 600 FCFA </w:t>
+            </w:r>
+            <w:r>
+              <w:rPr>
+                <w:i/>
+                <w:color w:val="1E293B"/>
+              </w:rPr>
+              <w:t>(Tarif hôpital + 600 F)</w:t>
             </w:r>
           </w:p>
         </w:tc>
         <w:tc>
           <w:tcPr>
-            <w:tcW w:type="dxa" w:w="3120"/>
+            <w:tcW w:type="dxa" w:w="1872"/>
+            <w:shd w:fill="F8FAFC"/>
+            <w:tcMar>
+              <w:top w:w="120" w:type="dxa"/>
+              <w:bottom w:w="120" w:type="dxa"/>
+              <w:left w:w="150" w:type="dxa"/>
+              <w:right w:w="150" w:type="dxa"/>
+            </w:tcMar>
+          </w:tcPr>
+          <w:p>
+            <w:pPr>
+              <w:spacing w:before="80" w:after="80" w:line="276" w:lineRule="auto"/>
+            </w:pPr>
+            <w:r/>
+            <w:r>
+              <w:rPr>
+                <w:b/>
+                <w:color w:val="1E293B"/>
+              </w:rPr>
+              <w:t>3 000 FCFA (100%)</w:t>
+            </w:r>
+          </w:p>
+        </w:tc>
+        <w:tc>
+          <w:tcPr>
+            <w:tcW w:type="dxa" w:w="1872"/>
             <w:shd w:fill="F8FAFC"/>
             <w:tcMar>
               <w:top w:w="120" w:type="dxa"/>
@@ -2785,7 +3158,45 @@
               <w:rPr>
                 <w:color w:val="1E293B"/>
               </w:rPr>
-              <w:t>Honoraires reversés au praticien / hôpital sous déduction de la commission de service eDoctor.</w:t>
+              <w:t>—</w:t>
+            </w:r>
+          </w:p>
+        </w:tc>
+        <w:tc>
+          <w:tcPr>
+            <w:tcW w:type="dxa" w:w="1872"/>
+            <w:shd w:fill="F8FAFC"/>
+            <w:tcMar>
+              <w:top w:w="120" w:type="dxa"/>
+              <w:bottom w:w="120" w:type="dxa"/>
+              <w:left w:w="150" w:type="dxa"/>
+              <w:right w:w="150" w:type="dxa"/>
+            </w:tcMar>
+          </w:tcPr>
+          <w:p>
+            <w:pPr>
+              <w:spacing w:before="80" w:after="80" w:line="276" w:lineRule="auto"/>
+            </w:pPr>
+            <w:r/>
+            <w:r>
+              <w:rPr>
+                <w:b/>
+                <w:color w:val="1E293B"/>
+              </w:rPr>
+              <w:t>600 FCFA</w:t>
+            </w:r>
+            <w:r>
+              <w:rPr>
+                <w:color w:val="1E293B"/>
+              </w:rPr>
+              <w:t xml:space="preserve"> </w:t>
+            </w:r>
+            <w:r>
+              <w:rPr>
+                <w:i/>
+                <w:color w:val="1E293B"/>
+              </w:rPr>
+              <w:t>(Frais plateforme &amp; Mobile Money)</w:t>
             </w:r>
           </w:p>
         </w:tc>
@@ -2793,7 +3204,7 @@
       <w:tr>
         <w:tc>
           <w:tcPr>
-            <w:tcW w:type="dxa" w:w="3120"/>
+            <w:tcW w:type="dxa" w:w="1872"/>
             <w:shd w:fill="FFFFFF"/>
             <w:tcMar>
               <w:top w:w="120" w:type="dxa"/>
@@ -2812,13 +3223,13 @@
                 <w:b/>
                 <w:color w:val="1E293B"/>
               </w:rPr>
-              <w:t>Médicaments délivrés</w:t>
+              <w:t>Commande Pharmacie (Retrait)</w:t>
             </w:r>
           </w:p>
         </w:tc>
         <w:tc>
           <w:tcPr>
-            <w:tcW w:type="dxa" w:w="3120"/>
+            <w:tcW w:type="dxa" w:w="1872"/>
             <w:shd w:fill="FFFFFF"/>
             <w:tcMar>
               <w:top w:w="120" w:type="dxa"/>
@@ -2836,13 +3247,13 @@
               <w:rPr>
                 <w:color w:val="1E293B"/>
               </w:rPr>
-              <w:t>Paiement en ligne ou au comptoir selon le mode choisi.</w:t>
+              <w:t>Prix Médicaments + 150 F</w:t>
             </w:r>
           </w:p>
         </w:tc>
         <w:tc>
           <w:tcPr>
-            <w:tcW w:type="dxa" w:w="3120"/>
+            <w:tcW w:type="dxa" w:w="1872"/>
             <w:shd w:fill="FFFFFF"/>
             <w:tcMar>
               <w:top w:w="120" w:type="dxa"/>
@@ -2860,7 +3271,70 @@
               <w:rPr>
                 <w:color w:val="1E293B"/>
               </w:rPr>
-              <w:t>Montant intégral versé au compte de l'officine partenaire.</w:t>
+              <w:t>—</w:t>
+            </w:r>
+          </w:p>
+        </w:tc>
+        <w:tc>
+          <w:tcPr>
+            <w:tcW w:type="dxa" w:w="1872"/>
+            <w:shd w:fill="FFFFFF"/>
+            <w:tcMar>
+              <w:top w:w="120" w:type="dxa"/>
+              <w:bottom w:w="120" w:type="dxa"/>
+              <w:left w:w="150" w:type="dxa"/>
+              <w:right w:w="150" w:type="dxa"/>
+            </w:tcMar>
+          </w:tcPr>
+          <w:p>
+            <w:pPr>
+              <w:spacing w:before="80" w:after="80" w:line="276" w:lineRule="auto"/>
+            </w:pPr>
+            <w:r/>
+            <w:r>
+              <w:rPr>
+                <w:b/>
+                <w:color w:val="1E293B"/>
+              </w:rPr>
+              <w:t>100% Prix Médicaments</w:t>
+            </w:r>
+          </w:p>
+        </w:tc>
+        <w:tc>
+          <w:tcPr>
+            <w:tcW w:type="dxa" w:w="1872"/>
+            <w:shd w:fill="FFFFFF"/>
+            <w:tcMar>
+              <w:top w:w="120" w:type="dxa"/>
+              <w:bottom w:w="120" w:type="dxa"/>
+              <w:left w:w="150" w:type="dxa"/>
+              <w:right w:w="150" w:type="dxa"/>
+            </w:tcMar>
+          </w:tcPr>
+          <w:p>
+            <w:pPr>
+              <w:spacing w:before="80" w:after="80" w:line="276" w:lineRule="auto"/>
+            </w:pPr>
+            <w:r/>
+            <w:r>
+              <w:rPr>
+                <w:b/>
+                <w:color w:val="1E293B"/>
+              </w:rPr>
+              <w:t>150 FCFA</w:t>
+            </w:r>
+            <w:r>
+              <w:rPr>
+                <w:color w:val="1E293B"/>
+              </w:rPr>
+              <w:t xml:space="preserve"> </w:t>
+            </w:r>
+            <w:r>
+              <w:rPr>
+                <w:i/>
+                <w:color w:val="1E293B"/>
+              </w:rPr>
+              <w:t>(Frais recherche stock)</w:t>
             </w:r>
           </w:p>
         </w:tc>
@@ -2868,7 +3342,7 @@
       <w:tr>
         <w:tc>
           <w:tcPr>
-            <w:tcW w:type="dxa" w:w="3120"/>
+            <w:tcW w:type="dxa" w:w="1872"/>
             <w:shd w:fill="F8FAFC"/>
             <w:tcMar>
               <w:top w:w="120" w:type="dxa"/>
@@ -2887,13 +3361,13 @@
                 <w:b/>
                 <w:color w:val="1E293B"/>
               </w:rPr>
-              <w:t>Livraison express</w:t>
+              <w:t>Livraison Express (Distance 5 km)</w:t>
             </w:r>
           </w:p>
         </w:tc>
         <w:tc>
           <w:tcPr>
-            <w:tcW w:type="dxa" w:w="3120"/>
+            <w:tcW w:type="dxa" w:w="1872"/>
             <w:shd w:fill="F8FAFC"/>
             <w:tcMar>
               <w:top w:w="120" w:type="dxa"/>
@@ -2911,13 +3385,20 @@
               <w:rPr>
                 <w:color w:val="1E293B"/>
               </w:rPr>
-              <w:t>Forfait calculé selon la zone urbaine (Grand Lomé).</w:t>
+              <w:t xml:space="preserve">950 FCFA </w:t>
+            </w:r>
+            <w:r>
+              <w:rPr>
+                <w:i/>
+                <w:color w:val="1E293B"/>
+              </w:rPr>
+              <w:t>(500 F base + 3×150 F)</w:t>
             </w:r>
           </w:p>
         </w:tc>
         <w:tc>
           <w:tcPr>
-            <w:tcW w:type="dxa" w:w="3120"/>
+            <w:tcW w:type="dxa" w:w="1872"/>
             <w:shd w:fill="F8FAFC"/>
             <w:tcMar>
               <w:top w:w="120" w:type="dxa"/>
@@ -2935,7 +3416,83 @@
               <w:rPr>
                 <w:color w:val="1E293B"/>
               </w:rPr>
-              <w:t>Rémunération du coursier partenaire agréé.</w:t>
+              <w:t>—</w:t>
+            </w:r>
+          </w:p>
+        </w:tc>
+        <w:tc>
+          <w:tcPr>
+            <w:tcW w:type="dxa" w:w="1872"/>
+            <w:shd w:fill="F8FAFC"/>
+            <w:tcMar>
+              <w:top w:w="120" w:type="dxa"/>
+              <w:bottom w:w="120" w:type="dxa"/>
+              <w:left w:w="150" w:type="dxa"/>
+              <w:right w:w="150" w:type="dxa"/>
+            </w:tcMar>
+          </w:tcPr>
+          <w:p>
+            <w:pPr>
+              <w:spacing w:before="80" w:after="80" w:line="276" w:lineRule="auto"/>
+            </w:pPr>
+            <w:r/>
+            <w:r>
+              <w:rPr>
+                <w:b/>
+                <w:color w:val="1E293B"/>
+              </w:rPr>
+              <w:t>700 FCFA</w:t>
+            </w:r>
+            <w:r>
+              <w:rPr>
+                <w:color w:val="1E293B"/>
+              </w:rPr>
+              <w:t xml:space="preserve"> </w:t>
+            </w:r>
+            <w:r>
+              <w:rPr>
+                <w:i/>
+                <w:color w:val="1E293B"/>
+              </w:rPr>
+              <w:t>(Coursier partenaire)</w:t>
+            </w:r>
+          </w:p>
+        </w:tc>
+        <w:tc>
+          <w:tcPr>
+            <w:tcW w:type="dxa" w:w="1872"/>
+            <w:shd w:fill="F8FAFC"/>
+            <w:tcMar>
+              <w:top w:w="120" w:type="dxa"/>
+              <w:bottom w:w="120" w:type="dxa"/>
+              <w:left w:w="150" w:type="dxa"/>
+              <w:right w:w="150" w:type="dxa"/>
+            </w:tcMar>
+          </w:tcPr>
+          <w:p>
+            <w:pPr>
+              <w:spacing w:before="80" w:after="80" w:line="276" w:lineRule="auto"/>
+            </w:pPr>
+            <w:r/>
+            <w:r>
+              <w:rPr>
+                <w:b/>
+                <w:color w:val="1E293B"/>
+              </w:rPr>
+              <w:t>250 FCFA</w:t>
+            </w:r>
+            <w:r>
+              <w:rPr>
+                <w:color w:val="1E293B"/>
+              </w:rPr>
+              <w:t xml:space="preserve"> </w:t>
+            </w:r>
+            <w:r>
+              <w:rPr>
+                <w:i/>
+                <w:color w:val="1E293B"/>
+              </w:rPr>
+              <w:t>(Marge coordination)</w:t>
             </w:r>
           </w:p>
         </w:tc>
@@ -2943,7 +3500,7 @@
       <w:tr>
         <w:tc>
           <w:tcPr>
-            <w:tcW w:type="dxa" w:w="3120"/>
+            <w:tcW w:type="dxa" w:w="1872"/>
             <w:shd w:fill="FFFFFF"/>
             <w:tcMar>
               <w:top w:w="120" w:type="dxa"/>
@@ -2962,13 +3519,13 @@
                 <w:b/>
                 <w:color w:val="1E293B"/>
               </w:rPr>
-              <w:t>Soins infirmiers à domicile</w:t>
+              <w:t>Soins Infirmiers à Domicile</w:t>
             </w:r>
           </w:p>
         </w:tc>
         <w:tc>
           <w:tcPr>
-            <w:tcW w:type="dxa" w:w="3120"/>
+            <w:tcW w:type="dxa" w:w="1872"/>
             <w:shd w:fill="FFFFFF"/>
             <w:tcMar>
               <w:top w:w="120" w:type="dxa"/>
@@ -2986,13 +3543,38 @@
               <w:rPr>
                 <w:color w:val="1E293B"/>
               </w:rPr>
-              <w:t>Forfait à l'acte médical conventionné.</w:t>
+              <w:t>Tarif Hôpital + 600 FCFA</w:t>
             </w:r>
           </w:p>
         </w:tc>
         <w:tc>
           <w:tcPr>
-            <w:tcW w:type="dxa" w:w="3120"/>
+            <w:tcW w:type="dxa" w:w="1872"/>
+            <w:shd w:fill="FFFFFF"/>
+            <w:tcMar>
+              <w:top w:w="120" w:type="dxa"/>
+              <w:bottom w:w="120" w:type="dxa"/>
+              <w:left w:w="150" w:type="dxa"/>
+              <w:right w:w="150" w:type="dxa"/>
+            </w:tcMar>
+          </w:tcPr>
+          <w:p>
+            <w:pPr>
+              <w:spacing w:before="80" w:after="80" w:line="276" w:lineRule="auto"/>
+            </w:pPr>
+            <w:r/>
+            <w:r>
+              <w:rPr>
+                <w:b/>
+                <w:color w:val="1E293B"/>
+              </w:rPr>
+              <w:t>100% Tarif Soin</w:t>
+            </w:r>
+          </w:p>
+        </w:tc>
+        <w:tc>
+          <w:tcPr>
+            <w:tcW w:type="dxa" w:w="1872"/>
             <w:shd w:fill="FFFFFF"/>
             <w:tcMar>
               <w:top w:w="120" w:type="dxa"/>
@@ -3010,7 +3592,45 @@
               <w:rPr>
                 <w:color w:val="1E293B"/>
               </w:rPr>
-              <w:t>Rémunération reversée à la structure hospitalière de rattachement.</w:t>
+              <w:t>—</w:t>
+            </w:r>
+          </w:p>
+        </w:tc>
+        <w:tc>
+          <w:tcPr>
+            <w:tcW w:type="dxa" w:w="1872"/>
+            <w:shd w:fill="FFFFFF"/>
+            <w:tcMar>
+              <w:top w:w="120" w:type="dxa"/>
+              <w:bottom w:w="120" w:type="dxa"/>
+              <w:left w:w="150" w:type="dxa"/>
+              <w:right w:w="150" w:type="dxa"/>
+            </w:tcMar>
+          </w:tcPr>
+          <w:p>
+            <w:pPr>
+              <w:spacing w:before="80" w:after="80" w:line="276" w:lineRule="auto"/>
+            </w:pPr>
+            <w:r/>
+            <w:r>
+              <w:rPr>
+                <w:b/>
+                <w:color w:val="1E293B"/>
+              </w:rPr>
+              <w:t>600 FCFA</w:t>
+            </w:r>
+            <w:r>
+              <w:rPr>
+                <w:color w:val="1E293B"/>
+              </w:rPr>
+              <w:t xml:space="preserve"> </w:t>
+            </w:r>
+            <w:r>
+              <w:rPr>
+                <w:i/>
+                <w:color w:val="1E293B"/>
+              </w:rPr>
+              <w:t>(Frais de service)</w:t>
             </w:r>
           </w:p>
         </w:tc>

</xml_diff>

<commit_message>
feat(prescription): geolocated nearby stock filtering for doctor prescriptions (DG directive RG-04 Bis)
</commit_message>
<xml_diff>
--- a/docs/01_DOCUMENT_METIER_ET_REGLES_DE_GESTION.docx
+++ b/docs/01_DOCUMENT_METIER_ET_REGLES_DE_GESTION.docx
@@ -1816,6 +1816,144 @@
           <w:color w:val="1E293B"/>
         </w:rPr>
         <w:t xml:space="preserve"> (non modifiable après signature numérique).</w:t>
+      </w:r>
+    </w:p>
+    <w:p>
+      <w:pPr>
+        <w:keepNext/>
+        <w:spacing w:before="200" w:after="80"/>
+      </w:pPr>
+      <w:r>
+        <w:rPr>
+          <w:rFonts w:ascii="Arial" w:hAnsi="Arial"/>
+          <w:b/>
+          <w:color w:val="529927"/>
+          <w:sz w:val="24"/>
+        </w:rPr>
+        <w:t>3.4.1. Règle RG-04 Bis : Filtrage Géolocalisé des Médicaments en Stock (Directive DG)</w:t>
+      </w:r>
+    </w:p>
+    <w:p>
+      <w:pPr>
+        <w:pStyle w:val="ListBullet"/>
+        <w:spacing w:before="20" w:after="40" w:line="276" w:lineRule="auto"/>
+      </w:pPr>
+      <w:r>
+        <w:rPr>
+          <w:b/>
+          <w:color w:val="1E293B"/>
+        </w:rPr>
+        <w:t>Garantie d'accès au traitement :</w:t>
+      </w:r>
+      <w:r>
+        <w:rPr>
+          <w:color w:val="1E293B"/>
+        </w:rPr>
+        <w:t xml:space="preserve"> Pour éviter au patient la déconvenue d'une ordonnance comportant des molécules introuvables sur le marché local, le sélecteur de prescription du médecin applique </w:t>
+      </w:r>
+      <w:r>
+        <w:rPr>
+          <w:b/>
+          <w:color w:val="1E293B"/>
+        </w:rPr>
+        <w:t>par défaut un filtrage strict sur les médicaments disponibles en stock</w:t>
+      </w:r>
+      <w:r>
+        <w:rPr>
+          <w:color w:val="1E293B"/>
+        </w:rPr>
+        <w:t xml:space="preserve"> (</w:t>
+      </w:r>
+      <w:r>
+        <w:rPr>
+          <w:rFonts w:ascii="Consolas" w:hAnsi="Consolas"/>
+          <w:color w:val="132A45"/>
+          <w:sz w:val="19"/>
+        </w:rPr>
+        <w:t>quantity &gt; 0</w:t>
+      </w:r>
+      <w:r>
+        <w:rPr>
+          <w:color w:val="1E293B"/>
+        </w:rPr>
+        <w:t>) dans les pharmacies agréées ouvertes à proximité (&lt; 15 km) du patient.</w:t>
+      </w:r>
+    </w:p>
+    <w:p>
+      <w:pPr>
+        <w:pStyle w:val="ListBullet"/>
+        <w:spacing w:before="20" w:after="40" w:line="276" w:lineRule="auto"/>
+      </w:pPr>
+      <w:r>
+        <w:rPr>
+          <w:b/>
+          <w:color w:val="1E293B"/>
+        </w:rPr>
+        <w:t>Indicateurs de disponibilité :</w:t>
+      </w:r>
+      <w:r>
+        <w:rPr>
+          <w:color w:val="1E293B"/>
+        </w:rPr>
+        <w:t xml:space="preserve"> Chaque médicament affiche un badge de disponibilité explicite (ex : </w:t>
+      </w:r>
+      <w:r>
+        <w:rPr>
+          <w:i/>
+          <w:color w:val="1E293B"/>
+        </w:rPr>
+        <w:t>« En stock (3 pharmacies proches) »</w:t>
+      </w:r>
+      <w:r>
+        <w:rPr>
+          <w:color w:val="1E293B"/>
+        </w:rPr>
+        <w:t>).</w:t>
+      </w:r>
+    </w:p>
+    <w:p>
+      <w:pPr>
+        <w:pStyle w:val="ListBullet"/>
+        <w:spacing w:before="20" w:after="40" w:line="276" w:lineRule="auto"/>
+      </w:pPr>
+      <w:r>
+        <w:rPr>
+          <w:b/>
+          <w:color w:val="1E293B"/>
+        </w:rPr>
+        <w:t>Déblocage déontologique (Filet de sécurité) :</w:t>
+      </w:r>
+      <w:r>
+        <w:rPr>
+          <w:color w:val="1E293B"/>
+        </w:rPr>
+        <w:t xml:space="preserve"> Si un impératif thérapeutique exige une molécule rare ou spécifique non répertoriée en stock immédiat sur la plateforme, le médecin peut d'un clic désactiver le filtre pour afficher </w:t>
+      </w:r>
+      <w:r>
+        <w:rPr>
+          <w:i/>
+          <w:color w:val="1E293B"/>
+        </w:rPr>
+        <w:t>« Tout le catalogue national »</w:t>
+      </w:r>
+      <w:r>
+        <w:rPr>
+          <w:color w:val="1E293B"/>
+        </w:rPr>
+        <w:t xml:space="preserve"> avec mention d'avertissement </w:t>
+      </w:r>
+      <w:r>
+        <w:rPr>
+          <w:i/>
+          <w:color w:val="1E293B"/>
+        </w:rPr>
+        <w:t>« Non détecté en stock eDoctor »</w:t>
+      </w:r>
+      <w:r>
+        <w:rPr>
+          <w:color w:val="1E293B"/>
+        </w:rPr>
+        <w:t>.</w:t>
       </w:r>
     </w:p>
     <w:p>

</xml_diff>

<commit_message>
feat: securisation teleconsultations, soins infirmiers a domicile, portefeuilles virtuels et synchronisation globale
</commit_message>
<xml_diff>
--- a/docs/01_DOCUMENT_METIER_ET_REGLES_DE_GESTION.docx
+++ b/docs/01_DOCUMENT_METIER_ET_REGLES_DE_GESTION.docx
@@ -296,17 +296,17 @@
               <w:br/>
               <w:t xml:space="preserve">                                   │</w:t>
               <w:br/>
-              <w:t xml:space="preserve">         ┌─────────────────────────┼─────────────────────────┐</w:t>
+              <w:t xml:space="preserve">         ┌─────────────────────────┼─────────────────────────┬─────────────────────────┐</w:t>
               <w:br/>
-              <w:t xml:space="preserve">         ▼                         ▼                         ▼</w:t>
+              <w:t xml:space="preserve">         ▼                         ▼                         ▼                         ▼</w:t>
               <w:br/>
-              <w:t>┌──────────────────┐      ┌──────────────────┐      ┌──────────────────┐</w:t>
+              <w:t>┌──────────────────┐      ┌──────────────────┐      ┌──────────────────┐      ┌──────────────────┐</w:t>
               <w:br/>
-              <w:t>│  ESPACE PATIENT  │      │ ESPACE PRATICIEN │      │ ESPACE PHARMACIE │</w:t>
+              <w:t>│  ESPACE PATIENT  │      │ ESPACE PRATICIEN │      │ ESPACE PHARMACIE │      │   SUPER-ADMIN    │</w:t>
               <w:br/>
-              <w:t>│ (Mobile Flutter) │      │ (Médecin/Hôpital)│      │  (Web &amp; Stocks)  │</w:t>
+              <w:t>│ (Mobile Flutter) │      │ (Médecin/Hôpital)│      │  (Web &amp; Stocks)  │      │ (`edoctor_admin`)│</w:t>
               <w:br/>
-              <w:t>└──────────────────┘      └──────────────────┘      └──────────────────┘</w:t>
+              <w:t>└──────────────────┘      └──────────────────┘      └──────────────────┘      └──────────────────┘</w:t>
             </w:r>
           </w:p>
         </w:tc>
@@ -2534,6 +2534,270 @@
     </w:p>
     <w:p>
       <w:pPr>
+        <w:keepNext/>
+        <w:spacing w:before="200" w:after="80"/>
+      </w:pPr>
+      <w:r>
+        <w:rPr>
+          <w:rFonts w:ascii="Arial" w:hAnsi="Arial"/>
+          <w:b/>
+          <w:color w:val="529927"/>
+          <w:sz w:val="24"/>
+        </w:rPr>
+        <w:t>3.9. Règle RG-09 : Double Authentification (2FA) &amp; Protection Anti-Brute-Force</w:t>
+      </w:r>
+    </w:p>
+    <w:p>
+      <w:pPr>
+        <w:pStyle w:val="ListBullet"/>
+        <w:spacing w:before="20" w:after="40" w:line="276" w:lineRule="auto"/>
+      </w:pPr>
+      <w:r>
+        <w:rPr>
+          <w:b/>
+          <w:color w:val="1E293B"/>
+        </w:rPr>
+        <w:t>Double Authentification (2FA OTP) :</w:t>
+      </w:r>
+      <w:r>
+        <w:rPr>
+          <w:color w:val="1E293B"/>
+        </w:rPr>
+        <w:t xml:space="preserve"> Pour toute tentative de connexion (patients, praticiens, pharmaciens, administrateurs), un code temporaire à 6 chiffres est obligatoirement expédié à l'adresse email de l'utilisateur via la passerelle transactionnelle Brevo REST API v3 (</w:t>
+      </w:r>
+      <w:r>
+        <w:rPr>
+          <w:rFonts w:ascii="Consolas" w:hAnsi="Consolas"/>
+          <w:color w:val="132A45"/>
+          <w:sz w:val="19"/>
+        </w:rPr>
+        <w:t>contacts@ewaregroup.org</w:t>
+      </w:r>
+      <w:r>
+        <w:rPr>
+          <w:color w:val="1E293B"/>
+        </w:rPr>
+        <w:t>).</w:t>
+      </w:r>
+    </w:p>
+    <w:p>
+      <w:pPr>
+        <w:pStyle w:val="ListBullet"/>
+        <w:spacing w:before="20" w:after="40" w:line="276" w:lineRule="auto"/>
+      </w:pPr>
+      <w:r>
+        <w:rPr>
+          <w:b/>
+          <w:color w:val="1E293B"/>
+        </w:rPr>
+        <w:t>Durée de validité :</w:t>
+      </w:r>
+      <w:r>
+        <w:rPr>
+          <w:color w:val="1E293B"/>
+        </w:rPr>
+        <w:t xml:space="preserve"> Le jeton OTP expire après 10 minutes.</w:t>
+      </w:r>
+    </w:p>
+    <w:p>
+      <w:pPr>
+        <w:pStyle w:val="ListBullet"/>
+        <w:spacing w:before="20" w:after="40" w:line="276" w:lineRule="auto"/>
+      </w:pPr>
+      <w:r>
+        <w:rPr>
+          <w:b/>
+          <w:color w:val="1E293B"/>
+        </w:rPr>
+        <w:t>Complexité des mots de passe :</w:t>
+      </w:r>
+      <w:r>
+        <w:rPr>
+          <w:color w:val="1E293B"/>
+        </w:rPr>
+        <w:t xml:space="preserve"> Minimum 8 caractères, associant lettres minuscules, majuscules, chiffres et caractères spéciaux.</w:t>
+      </w:r>
+    </w:p>
+    <w:p>
+      <w:pPr>
+        <w:pStyle w:val="ListBullet"/>
+        <w:spacing w:before="20" w:after="40" w:line="276" w:lineRule="auto"/>
+      </w:pPr>
+      <w:r>
+        <w:rPr>
+          <w:b/>
+          <w:color w:val="1E293B"/>
+        </w:rPr>
+        <w:t>Verrouillage automatique (Account Lockout) :</w:t>
+      </w:r>
+      <w:r>
+        <w:rPr>
+          <w:color w:val="1E293B"/>
+        </w:rPr>
+        <w:t xml:space="preserve"> Tout compte subissant </w:t>
+      </w:r>
+      <w:r>
+        <w:rPr>
+          <w:b/>
+          <w:color w:val="1E293B"/>
+        </w:rPr>
+        <w:t>10 tentatives infructueuses consécutives</w:t>
+      </w:r>
+      <w:r>
+        <w:rPr>
+          <w:color w:val="1E293B"/>
+        </w:rPr>
+        <w:t xml:space="preserve"> est immédiatement verrouillé pendant </w:t>
+      </w:r>
+      <w:r>
+        <w:rPr>
+          <w:b/>
+          <w:color w:val="1E293B"/>
+        </w:rPr>
+        <w:t>30 minutes</w:t>
+      </w:r>
+      <w:r>
+        <w:rPr>
+          <w:color w:val="1E293B"/>
+        </w:rPr>
+        <w:t>. Un courriel d'alerte de sécurité est expédié à l'utilisateur avec réinitialisation du compteur lors d'une connexion validée.</w:t>
+      </w:r>
+    </w:p>
+    <w:p>
+      <w:pPr>
+        <w:keepNext/>
+        <w:spacing w:before="200" w:after="80"/>
+      </w:pPr>
+      <w:r>
+        <w:rPr>
+          <w:rFonts w:ascii="Arial" w:hAnsi="Arial"/>
+          <w:b/>
+          <w:color w:val="529927"/>
+          <w:sz w:val="24"/>
+        </w:rPr>
+        <w:t>3.10. Règle RG-10 : Sécurisation FinTech &amp; Intégrité Webhook FedaPay</w:t>
+      </w:r>
+    </w:p>
+    <w:p>
+      <w:pPr>
+        <w:pStyle w:val="ListBullet"/>
+        <w:spacing w:before="20" w:after="40" w:line="276" w:lineRule="auto"/>
+      </w:pPr>
+      <w:r>
+        <w:rPr>
+          <w:b/>
+          <w:color w:val="1E293B"/>
+        </w:rPr>
+        <w:t>Interdiction des paiements simulés en production :</w:t>
+      </w:r>
+      <w:r>
+        <w:rPr>
+          <w:color w:val="1E293B"/>
+        </w:rPr>
+        <w:t xml:space="preserve"> Tout paiement direct fictif est strictement bloqué en environnement de production (</w:t>
+      </w:r>
+      <w:r>
+        <w:rPr>
+          <w:rFonts w:ascii="Consolas" w:hAnsi="Consolas"/>
+          <w:color w:val="132A45"/>
+          <w:sz w:val="19"/>
+        </w:rPr>
+        <w:t>APP_ENV=production</w:t>
+      </w:r>
+      <w:r>
+        <w:rPr>
+          <w:color w:val="1E293B"/>
+        </w:rPr>
+        <w:t>).</w:t>
+      </w:r>
+    </w:p>
+    <w:p>
+      <w:pPr>
+        <w:pStyle w:val="ListBullet"/>
+        <w:spacing w:before="20" w:after="40" w:line="276" w:lineRule="auto"/>
+      </w:pPr>
+      <w:r>
+        <w:rPr>
+          <w:b/>
+          <w:color w:val="1E293B"/>
+        </w:rPr>
+        <w:t>Validation cryptographique HMAC :</w:t>
+      </w:r>
+      <w:r>
+        <w:rPr>
+          <w:color w:val="1E293B"/>
+        </w:rPr>
+        <w:t xml:space="preserve"> Chaque notification webhook émise par la passerelle FedaPay doit obligatoirement comporter une signature valide vérifiée à l'aide de la clé secrète </w:t>
+      </w:r>
+      <w:r>
+        <w:rPr>
+          <w:rFonts w:ascii="Consolas" w:hAnsi="Consolas"/>
+          <w:color w:val="132A45"/>
+          <w:sz w:val="19"/>
+        </w:rPr>
+        <w:t>FEDAPAY_WEBHOOK_SECRET</w:t>
+      </w:r>
+      <w:r>
+        <w:rPr>
+          <w:color w:val="1E293B"/>
+        </w:rPr>
+        <w:t xml:space="preserve"> avant tout déblocage d'acte médical ou de commande.</w:t>
+      </w:r>
+    </w:p>
+    <w:p>
+      <w:pPr>
+        <w:pStyle w:val="ListBullet"/>
+        <w:spacing w:before="20" w:after="40" w:line="276" w:lineRule="auto"/>
+      </w:pPr>
+      <w:r>
+        <w:rPr>
+          <w:b/>
+          <w:color w:val="1E293B"/>
+        </w:rPr>
+        <w:t>Limitation de débit (Rate Limiting) :</w:t>
+      </w:r>
+      <w:r>
+        <w:rPr>
+          <w:color w:val="1E293B"/>
+        </w:rPr>
+        <w:t xml:space="preserve"> Les routes de réception des webhooks financiers sont protégées par un throttle strict fixé à 60 requêtes par minute (</w:t>
+      </w:r>
+      <w:r>
+        <w:rPr>
+          <w:rFonts w:ascii="Consolas" w:hAnsi="Consolas"/>
+          <w:color w:val="132A45"/>
+          <w:sz w:val="19"/>
+        </w:rPr>
+        <w:t>throttle:webhook</w:t>
+      </w:r>
+      <w:r>
+        <w:rPr>
+          <w:color w:val="1E293B"/>
+        </w:rPr>
+        <w:t>) pour neutraliser toute tentative de saturation ou de rejeu frauduleux.</w:t>
+      </w:r>
+    </w:p>
+    <w:p>
+      <w:pPr>
+        <w:pStyle w:val="ListBullet"/>
+        <w:spacing w:before="20" w:after="40" w:line="276" w:lineRule="auto"/>
+      </w:pPr>
+      <w:r>
+        <w:rPr>
+          <w:b/>
+          <w:color w:val="1E293B"/>
+        </w:rPr>
+        <w:t>Mécanisme d'Escrow (Séquestre) :</w:t>
+      </w:r>
+      <w:r>
+        <w:rPr>
+          <w:color w:val="1E293B"/>
+        </w:rPr>
+        <w:t xml:space="preserve"> Les fonds perçus sont séquestrés sur le compte de la plateforme jusqu'à la délivrance effective de la consultation médicale ou la remise des médicaments au comptoir/coursier.</w:t>
+      </w:r>
+    </w:p>
+    <w:p>
+      <w:pPr>
         <w:spacing w:before="120" w:after="240"/>
       </w:pPr>
       <w:r>

</xml_diff>